<commit_message>
Reassign E2/E3 ownership to Venkat after Bhavani left Group 15.
Update team roster to three active members and refresh reports, demo script, and contribution statements accordingly.

Co-authored-by: Cursor <cursoragent@cursor.com>
</commit_message>
<xml_diff>
--- a/reports/BANKING77_Group15_Technical_Report.docx
+++ b/reports/BANKING77_Group15_Technical_Report.docx
@@ -173,7 +173,7 @@
                 <w:b w:val="0"/>
                 <w:sz w:val="20"/>
               </w:rPr>
-              <w:t>Takkars Bhavani</w:t>
+              <w:t>Nisha Palanisamy</w:t>
             </w:r>
           </w:p>
         </w:tc>
@@ -188,7 +188,7 @@
                 <w:b w:val="0"/>
                 <w:sz w:val="20"/>
               </w:rPr>
-              <w:t>E2 prompt engineering, E3 decoding (report §§7–8)</w:t>
+              <w:t>E4 structured output, E5 tools, templates (report §10)</w:t>
             </w:r>
           </w:p>
         </w:tc>
@@ -205,7 +205,7 @@
                 <w:b w:val="0"/>
                 <w:sz w:val="20"/>
               </w:rPr>
-              <w:t>Nisha Palanisamy</w:t>
+              <w:t>Venkata Srinivasa Rao Tunuguntla</w:t>
             </w:r>
           </w:p>
         </w:tc>
@@ -220,39 +220,7 @@
                 <w:b w:val="0"/>
                 <w:sz w:val="20"/>
               </w:rPr>
-              <w:t>E4 structured output, E5 tools, templates (report §10)</w:t>
-            </w:r>
-          </w:p>
-        </w:tc>
-      </w:tr>
-      <w:tr>
-        <w:tc>
-          <w:tcPr>
-            <w:tcW w:type="dxa" w:w="4680"/>
-          </w:tcPr>
-          <w:p>
-            <w:r>
-              <w:rPr>
-                <w:rFonts w:ascii="Calibri" w:hAnsi="Calibri" w:eastAsia="Calibri"/>
-                <w:b w:val="0"/>
-                <w:sz w:val="20"/>
-              </w:rPr>
-              <w:t>Venkata Srinivasa Rao Tunuguntla</w:t>
-            </w:r>
-          </w:p>
-        </w:tc>
-        <w:tc>
-          <w:tcPr>
-            <w:tcW w:type="dxa" w:w="4680"/>
-          </w:tcPr>
-          <w:p>
-            <w:r>
-              <w:rPr>
-                <w:rFonts w:ascii="Calibri" w:hAnsi="Calibri" w:eastAsia="Calibri"/>
-                <w:b w:val="0"/>
-                <w:sz w:val="20"/>
-              </w:rPr>
-              <w:t>Architecture, adaptation, E6/E7 evaluation, report merge (§§4, 5, 9, 11–14)</w:t>
+              <w:t>E2/E3 prompts &amp; decoding (§§7–8); architecture, adaptation, E6/E7, report merge (§§4, 5, 9, 11–14)</w:t>
             </w:r>
           </w:p>
         </w:tc>
@@ -6836,34 +6804,6 @@
           <w:i w:val="0"/>
           <w:sz w:val="22"/>
         </w:rPr>
-        <w:t>Takkars Bhavani: responsible for E2 prompt-engineering experiments, E3 decoding study, prompt experiment log, and report §§7–8.</w:t>
-      </w:r>
-    </w:p>
-    <w:p>
-      <w:pPr>
-        <w:spacing w:after="160" w:before="0"/>
-      </w:pPr>
-      <w:r>
-        <w:rPr>
-          <w:rFonts w:ascii="Calibri" w:hAnsi="Calibri" w:eastAsia="Calibri"/>
-          <w:b w:val="0"/>
-          <w:i w:val="0"/>
-          <w:sz w:val="22"/>
-        </w:rPr>
-        <w:t>Member confirmation/signature: ____________________    Date: _______________</w:t>
-      </w:r>
-    </w:p>
-    <w:p>
-      <w:pPr>
-        <w:spacing w:after="160" w:before="0"/>
-      </w:pPr>
-      <w:r>
-        <w:rPr>
-          <w:rFonts w:ascii="Calibri" w:hAnsi="Calibri" w:eastAsia="Calibri"/>
-          <w:b w:val="0"/>
-          <w:i w:val="0"/>
-          <w:sz w:val="22"/>
-        </w:rPr>
         <w:t>Nisha Palanisamy: responsible for E4 structured JSON schema/validation, programmatic prompt templates, E5 tool schema/invocation, and report §10.</w:t>
       </w:r>
     </w:p>
@@ -6892,7 +6832,7 @@
           <w:i w:val="0"/>
           <w:sz w:val="22"/>
         </w:rPr>
-        <w:t>Venkata Srinivasa Rao Tunuguntla: responsible for generative-model/LLM architecture analysis, application architecture, prompting vs RAG vs PEFT, evaluation rubric, E6 failure analysis, responsible-use/limitations, E7 integration/demo, conclusion, and merging the group report (§§4, 5, 9, 11–14).</w:t>
+        <w:t>Venkata Srinivasa Rao Tunuguntla: responsible for E2 prompt-engineering experiments and E3 decoding study (report §§7–8); generative-model/LLM architecture analysis; application architecture; prompting vs RAG vs PEFT; evaluation rubric; E6 failure analysis; responsible-use/limitations; E7 integration/demo; conclusion; and merging the group report (§§4, 5, 9, 11–14).</w:t>
       </w:r>
     </w:p>
     <w:p>

</xml_diff>

<commit_message>
Regenerate technical report after demo file cleanup.
Co-authored-by: Cursor <cursoragent@cursor.com>
</commit_message>
<xml_diff>
--- a/reports/BANKING77_Group15_Technical_Report.docx
+++ b/reports/BANKING77_Group15_Technical_Report.docx
@@ -6103,7 +6103,7 @@
           <w:i w:val="0"/>
           <w:sz w:val="22"/>
         </w:rPr>
-        <w:t>The integrated demo follows evidence/evaluation/E7_integration_checklist.md and demo/E7_demo_script.md. In the notebook we load pinned BANKING77 subsets, build messages with the locked prompt variant (zero_shot for the local 1.5b-instruct evidence pack), generate with greedy decoding, run validate_output, optionally dispatch_tool for TXN-DEMO-###, and log metrics against the rubric. The 8–10 minute group demonstration shows a failing E1 case, a valid JSON path, a successful mock tool call, a credential-bait refusal, and states the four primary metrics separately.</w:t>
+        <w:t>The integrated demo follows evidence/evaluation/E7_integration_checklist.md and evidence/evaluation/E7_integration_checklist.md and demo/VIDEO_LINK.txt. In the notebook we load pinned BANKING77 subsets, build messages with the locked prompt variant (zero_shot for the local 1.5b-instruct evidence pack), generate with greedy decoding, run validate_output, optionally dispatch_tool for TXN-DEMO-###, and log metrics against the rubric. The 8–10 minute group demonstration shows a failing E1 case, a valid JSON path, a successful mock tool call, a credential-bait refusal, and states the four primary metrics separately.</w:t>
       </w:r>
     </w:p>
     <w:p>
@@ -7600,7 +7600,7 @@
           <w:b w:val="0"/>
           <w:sz w:val="22"/>
         </w:rPr>
-        <w:t>Demo script: demo/E7_demo_script.md</w:t>
+        <w:t>Demo video: demo/VIDEO_LINK.txt</w:t>
       </w:r>
     </w:p>
     <w:sectPr>

</xml_diff>